<commit_message>
Remove Turkiye, refocus on Asia, regenerate all data, Skills without zip
</commit_message>
<xml_diff>
--- a/Lab Files/IHH_Quality_and_Safety_Committee_Minutes_Aug2026.docx
+++ b/Lab Files/IHH_Quality_and_Safety_Committee_Minutes_Aug2026.docx
@@ -479,47 +479,6 @@
               <w:rPr>
                 <w:sz w:val="18"/>
               </w:rPr>
-              <w:t>Dr Emre Yilmaz</w:t>
-            </w:r>
-          </w:p>
-        </w:tc>
-        <w:tc>
-          <w:tcPr>
-            <w:tcW w:type="dxa" w:w="5040"/>
-          </w:tcPr>
-          <w:p>
-            <w:r>
-              <w:rPr>
-                <w:sz w:val="18"/>
-              </w:rPr>
-              <w:t>Regional Medical Director, Turkiye Operations</w:t>
-            </w:r>
-          </w:p>
-        </w:tc>
-        <w:tc>
-          <w:tcPr>
-            <w:tcW w:type="dxa" w:w="1584"/>
-          </w:tcPr>
-          <w:p>
-            <w:r>
-              <w:rPr>
-                <w:sz w:val="18"/>
-              </w:rPr>
-              <w:t>Present (Teams)</w:t>
-            </w:r>
-          </w:p>
-        </w:tc>
-      </w:tr>
-      <w:tr>
-        <w:tc>
-          <w:tcPr>
-            <w:tcW w:type="dxa" w:w="2736"/>
-          </w:tcPr>
-          <w:p>
-            <w:r>
-              <w:rPr>
-                <w:sz w:val="18"/>
-              </w:rPr>
               <w:t>Grace Koh</w:t>
             </w:r>
           </w:p>
@@ -832,7 +791,7 @@
         <w:spacing w:after="120"/>
       </w:pPr>
       <w:r>
-        <w:t>Siti binti Ahmad presented the Group patient flow review for the period January to August 2026. Average length of stay for Orthopaedics at Gleneagles Kuala Lumpur has risen from 3.0 days in January to 4.8 days in August. The comparable figure across all other IHH hospitals has remained flat at approximately 2.7 days across the same period.</w:t>
+        <w:t>Siti binti Ahmad presented the Group patient flow review for the period January to August 2026. Average length of stay for Orthopaedics at Gleneagles Kuala Lumpur has risen from about 3.0 days in January to about 4.6 days in August. The comparable figure across all other IHH hospitals has remained flat at approximately 2.6 days across the same period.</w:t>
       </w:r>
     </w:p>
     <w:p>
@@ -891,7 +850,7 @@
         <w:spacing w:after="120"/>
       </w:pPr>
       <w:r>
-        <w:t>Siti binti Ahmad reported that the thirty-day readmission rate for Cardiology at Pantai Hospital Kuala Lumpur is approximately 13 percent, against a Group average of approximately 4 percent. Segmenting the cohort by whether a follow-up appointment was booked before discharge shows the difference clearly. Where a follow-up appointment was booked, the readmission rate is broadly in line with the Group average. Where no follow-up appointment was booked, the readmission rate is approximately six times higher.</w:t>
+        <w:t>Siti binti Ahmad reported that the thirty-day readmission rate for Cardiology at Pantai Hospital Kuala Lumpur is approximately 15 percent, against a Group average of approximately 5 percent. Segmenting the cohort by whether a follow-up appointment was booked before discharge shows the difference clearly. Where a follow-up appointment was booked, the readmission rate is broadly in line with the Group average. Where no follow-up appointment was booked, the readmission rate is close to nine times higher.</w:t>
       </w:r>
     </w:p>
     <w:p>
@@ -934,7 +893,7 @@
         <w:spacing w:after="120"/>
       </w:pPr>
       <w:r>
-        <w:t>Grace Koh presented the theatre utilisation review. The proportion of first cases of the day starting on time at Mount Elizabeth Novena has declined from approximately 89 percent in January to approximately 66 percent in August. Performance at the other IHH hospitals has remained broadly stable in the low to mid eighties across the same period.</w:t>
+        <w:t>Grace Koh presented the theatre utilisation review. The proportion of first cases of the day starting on time at Mount Elizabeth Novena has declined from approximately 91 percent in January to approximately 58 percent in August. Performance at the other IHH hospitals has remained broadly stable in the low to high eighties across the same period.</w:t>
       </w:r>
     </w:p>
     <w:p>
@@ -985,7 +944,7 @@
         <w:spacing w:after="120"/>
       </w:pPr>
       <w:r>
-        <w:t>In the absence of the Group Chief Nursing Officer, Siti binti Ahmad presented the workforce position. Overtime hours per shift on Ward 7 at Gleneagles Kuala Lumpur have risen roughly fourfold between January and August, while the position across all other wards has been flat. The rise tracks an increase in shifts running with an unfilled establishment post and an increase in unplanned absence on the same ward.</w:t>
+        <w:t>In the absence of the Group Chief Nursing Officer, Siti binti Ahmad presented the workforce position. Overtime hours per shift on Ward 7 at Gleneagles Kuala Lumpur have risen roughly sevenfold between January and August, while the position across all other wards has been flat. The rise tracks an increase in shifts running with an unfilled establishment post and an increase in unplanned absence on the same ward.</w:t>
       </w:r>
     </w:p>
     <w:p>

</xml_diff>